<commit_message>
fix: rekam suara panjang via transkripsi bertahap per menit, sesuaikan format perihal & Fakta-Fakta laporan
Rekaman >4.5MB gagal 413 di Vercel karena diunggah sekaligus dalam satu request.
Sekarang perekaman langsung dipecah jadi segmen 60 detik yang ditranskripsi dan
dibuang satu per satu, jadi durasi rekaman tidak lagi dibatasi ukuran payload
per-request dan bisa berjam-jam.

Co-Authored-By: Claude Sonnet 5 <noreply@anthropic.com>
</commit_message>
<xml_diff>
--- a/templates/laporan-informasi.docx
+++ b/templates/laporan-informasi.docx
@@ -872,7 +872,7 @@
                 <w:rFonts w:ascii="Calibri" w:cs="Calibri" w:eastAsia="Calibri" w:hAnsi="Calibri"/>
                 <w:rtl w:val="0"/>
               </w:rPr>
-              <w:t xml:space="preserve">:   Pelapor.</w:t>
+              <w:t xml:space="preserve">:   Ada pada pelapor.</w:t>
             </w:r>
           </w:p>
           <w:p>
@@ -1033,7 +1033,7 @@
           <w:vertAlign w:val="baseline"/>
           <w:rtl w:val="0"/>
         </w:rPr>
-        <w:t xml:space="preserve">HAL-HAL YANG DILAPORKAN </w:t>
+        <w:t xml:space="preserve">FAKTA-FAKTA </w:t>
       </w:r>
     </w:p>
     <w:p>

</xml_diff>